<commit_message>
Recast Autocards DS as SaaS cabinet access, not a software license
Co-authored-by: Alena931 <Alena931@users.noreply.github.com>
</commit_message>
<xml_diff>
--- a/DS_Avtokartochki_Starter.docx
+++ b/DS_Avtokartochki_Starter.docx
@@ -5,6 +5,7 @@
     <w:p>
       <w:pPr>
         <w:spacing w:after="280" w:before="0" w:line="240" w:lineRule="auto"/>
+        <w:ind w:firstLine="0"/>
         <w:jc w:val="left"/>
       </w:pPr>
       <w:r>
@@ -15,12 +16,13 @@
           <w:color w:val="000000"/>
           <w:sz w:val="20"/>
         </w:rPr>
-        <w:t>ЧЕРНОВИК ДЛЯ ЮРИСТА. Не является юридическим заключением. Цифры пакетов — пример. Перед подписанием согласовать с юридической службой Лицензиара.</w:t>
+        <w:t>ЧЕРНОВИК ДЛЯ ЮРИСТА. Не является юридическим заключением. Предмет — доступ к онлайн-сервису (личный кабинет), а не лицензия на экземпляр ПО. Льгота «без НДС», применяемая к лицензии SpacePlanner, к доступу к кабинету может не применяться — налоговый режим согласовать отдельно. Цифры пакетов — пример.</w:t>
       </w:r>
     </w:p>
     <w:p>
       <w:pPr>
         <w:spacing w:after="80" w:before="0" w:line="240" w:lineRule="auto"/>
+        <w:ind w:firstLine="0"/>
         <w:jc w:val="center"/>
       </w:pPr>
       <w:r>
@@ -37,6 +39,7 @@
     <w:p>
       <w:pPr>
         <w:spacing w:after="40" w:before="0" w:line="240" w:lineRule="auto"/>
+        <w:ind w:firstLine="0"/>
         <w:jc w:val="center"/>
       </w:pPr>
       <w:r>
@@ -53,6 +56,7 @@
     <w:p>
       <w:pPr>
         <w:spacing w:after="280" w:before="0" w:line="240" w:lineRule="auto"/>
+        <w:ind w:firstLine="0"/>
         <w:jc w:val="center"/>
       </w:pPr>
       <w:r>
@@ -119,7 +123,7 @@
           <w:color w:val="000000"/>
           <w:sz w:val="24"/>
         </w:rPr>
-        <w:t>________________________________________________________________, именуемое в дальнейшем «Лицензиар», в лице ________________________________________, действующего на основании ____________________, с одной стороны, и ________________________________________________________________, именуемое в дальнейшем «Лицензиат», в лице ________________________________________, действующего на основании ____________________, с другой стороны, совместно именуемые «Стороны», а по отдельности «Сторона», заключили настоящее дополнительное соглашение (далее — Соглашение) о нижеследующем.</w:t>
+        <w:t>________________________________________________________________, именуемое в дальнейшем «Исполнитель» (в Договоре — Лицензиар), в лице ________________________________________, действующего на основании ____________________, с одной стороны, и ________________________________________________________________, именуемое в дальнейшем «Заказчик» (в Договоре — Лицензиат), в лице ________________________________________, действующего на основании ____________________, с другой стороны, совместно именуемые «Стороны», заключили настоящее дополнительное соглашение (далее — Соглашение) о нижеследующем.</w:t>
       </w:r>
     </w:p>
     <w:p>
@@ -153,7 +157,7 @@
           <w:color w:val="000000"/>
           <w:sz w:val="24"/>
         </w:rPr>
-        <w:t>1.1. Лицензиар предоставляет Лицензиату право использования программы для ЭВМ «Автокарточки Starter» (далее — Продукт) на условиях простой (неисключительной) лицензии в объёме и на срок, установленные настоящим Соглашением, в контуре использования программы для ЭВМ SpacePlanner, права на которую предоставлены Лицензиату по Договору.</w:t>
+        <w:t>1.1. Исполнитель предоставляет Заказчику возмездный доступ к онлайн-сервису «Автокарточки Starter» (далее — Сервис), размещённому в информационно-телекоммуникационной сети «Интернет» по адресу: [https://____________________] (далее — Сайт Сервиса), путём создания личного кабинета Заказчика (учётная запись: логин и пароль).</w:t>
       </w:r>
     </w:p>
     <w:p>
@@ -170,7 +174,7 @@
           <w:color w:val="000000"/>
           <w:sz w:val="24"/>
         </w:rPr>
-        <w:t>1.2. Продукт предназначен для обогащения справочника товаров Лицензиата: подбора и записи весогабаритных характеристик единицы товара, находящейся в обороте и размещаемой на полке (далее — ВГХ), и фотоизображений указанной единицы товара, в том числе для последующего использования при управлении торговым пространством и выкладкой в SpacePlanner.</w:t>
+        <w:t>1.2. Функциональное назначение Сервиса: Заказчик загружает в личный кабинет файл в формате Excel с номенклатурным справочником; Исполнитель посредством Сервиса выполняет обогащение карточек товаров (ВГХ единицы товара на полке и фотоизображения) и предоставляет Заказчику результат в личном кабинете (просмотр, выгрузка обогащённого файла и (или) иной согласованный способ).</w:t>
       </w:r>
     </w:p>
     <w:p>
@@ -187,7 +191,24 @@
           <w:color w:val="000000"/>
           <w:sz w:val="24"/>
         </w:rPr>
-        <w:t>1.3. Продукт не заменяет SpacePlanner и учётную систему Лицензиата, не является услугой натурного обмера товара средствами измерений и не гарантирует соответствие результата требованиям обязательной сертификации, маркировки и таможенного оформления.</w:t>
+        <w:t>1.3. Сервис используется Заказчиком, имеющим действующие права на SpacePlanner по Договору, в том числе для последующей работы с выкладкой в SpacePlanner. Настоящее Соглашение не предоставляет и не изменяет лицензию на SpacePlanner. Доступ к Сервису не является предоставлением экземпляра программы для ЭВМ на материальном носителе и не тождественен лицензии по Договору.</w:t>
+      </w:r>
+    </w:p>
+    <w:p>
+      <w:pPr>
+        <w:spacing w:after="120" w:before="0" w:line="240" w:lineRule="auto"/>
+        <w:ind w:firstLine="709"/>
+        <w:jc w:val="both"/>
+      </w:pPr>
+      <w:r>
+        <w:rPr>
+          <w:rFonts w:ascii="Times New Roman" w:hAnsi="Times New Roman" w:eastAsia="Times New Roman"/>
+          <w:b w:val="0"/>
+          <w:i w:val="0"/>
+          <w:color w:val="000000"/>
+          <w:sz w:val="24"/>
+        </w:rPr>
+        <w:t>1.4. Сервис не заменяет SpacePlanner и учётную систему Заказчика, не является услугой натурного обмера товара средствами измерений.</w:t>
       </w:r>
     </w:p>
     <w:p>
@@ -221,7 +242,7 @@
           <w:color w:val="000000"/>
           <w:sz w:val="24"/>
         </w:rPr>
-        <w:t>2.1. Для целей Соглашения применяются следующие термины:</w:t>
+        <w:t>2.1. Для целей Соглашения:</w:t>
       </w:r>
     </w:p>
     <w:p>
@@ -238,7 +259,7 @@
           <w:color w:val="000000"/>
           <w:sz w:val="24"/>
         </w:rPr>
-        <w:t>SKU — позиция справочника товаров Лицензиата, идентифицируемая внутренним кодом Лицензиата.</w:t>
+        <w:t>Личный кабинет — защищённый раздел Сайта Сервиса, доступный Заказчику по логину и паролю.</w:t>
       </w:r>
     </w:p>
     <w:p>
@@ -255,7 +276,7 @@
           <w:color w:val="000000"/>
           <w:sz w:val="24"/>
         </w:rPr>
-        <w:t>Обогащение — обработка SKU средствами Продукта в целях заполнения (предложения к заполнению) ВГХ и (или) фотоизображения.</w:t>
+        <w:t>SKU — позиция номенклатурного справочника Заказчика, идентифицируемая внутренним кодом Заказчика.</w:t>
       </w:r>
     </w:p>
     <w:p>
@@ -272,7 +293,7 @@
           <w:color w:val="000000"/>
           <w:sz w:val="24"/>
         </w:rPr>
-        <w:t>Пакет — оплаченный Лицензиатом лимит количества SKU, в отношении которых выполняется Обогащение в течение Расчётного периода.</w:t>
+        <w:t>Обогащение — обработка SKU Сервисом в целях заполнения (предложения к заполнению) ВГХ и (или) фотоизображения.</w:t>
       </w:r>
     </w:p>
     <w:p>
@@ -289,7 +310,7 @@
           <w:color w:val="000000"/>
           <w:sz w:val="24"/>
         </w:rPr>
-        <w:t>Расчётный период — [календарный месяц / срок действия лицензии SpacePlanner по Договору / иной период: ____________].</w:t>
+        <w:t>Пакет — оплаченный лимит количества SKU, в отношении которых выполняется Обогащение в течение Расчётного периода.</w:t>
       </w:r>
     </w:p>
     <w:p>
@@ -306,7 +327,7 @@
           <w:color w:val="000000"/>
           <w:sz w:val="24"/>
         </w:rPr>
-        <w:t>Валидированный вариант — вариант ВГХ (и (или) фото), предложенный Продуктом как прошедший предусмотренную Продуктом проверку.</w:t>
+        <w:t>Расчётный период — [календарный месяц / срок, указанный в заявке / иной: ____________].</w:t>
       </w:r>
     </w:p>
     <w:p>
@@ -323,7 +344,7 @@
           <w:color w:val="000000"/>
           <w:sz w:val="24"/>
         </w:rPr>
-        <w:t>Типовой вариант — вариант ВГХ (и (или) фото), предложенный Продуктом на основании характеристик сходных товаров соответствующей категории.</w:t>
+        <w:t>Валидированный вариант и Типовой вариант — варианты ВГХ (и (или) фото), предлагаемые Сервисом при наличии нескольких значений.</w:t>
       </w:r>
     </w:p>
     <w:p>
@@ -340,7 +361,7 @@
           <w:color w:val="000000"/>
           <w:sz w:val="24"/>
         </w:rPr>
-        <w:t>3. ОБЪЁМ ПРАВ И ТАРИФ</w:t>
+        <w:t>3. ДОСТУП К ЛИЧНОМУ КАБИНЕТУ</w:t>
       </w:r>
     </w:p>
     <w:p>
@@ -357,7 +378,7 @@
           <w:color w:val="000000"/>
           <w:sz w:val="24"/>
         </w:rPr>
-        <w:t>3.1. Вознаграждение Лицензиара за предоставление права использования Продукта определяется выбранным Лицензиатом Пакетом согласно Приложению 1 к настоящему Соглашению.</w:t>
+        <w:t>3.1. В течение _____ (__________) рабочих дней с даты поступления оплаты Пакета (либо с даты подписания Соглашения, если доступ предоставляется до оплаты на условиях отсрочки) Исполнитель направляет Заказчику на адрес электронной почты ____________________ логин и пароль (либо ссылку на самостоятельную регистрацию) и адрес Сайта Сервиса.</w:t>
       </w:r>
     </w:p>
     <w:p>
@@ -374,7 +395,7 @@
           <w:color w:val="000000"/>
           <w:sz w:val="24"/>
         </w:rPr>
-        <w:t>3.2. Пример расчёта (не является офертой; актуальная сетка — в Приложении 1): Пакет 10 000 SKU за Расчётный период — 100 000 (Сто тысяч) рублей 00 копеек.</w:t>
+        <w:t>3.2. Заказчик обеспечивает сохранность логина и пароля, не передаёт их третьим лицам, за исключением работников Заказчика, допущенных к работе со справочником. Действия, совершённые в Личном кабинете с использованием логина Заказчика, считаются действиями Заказчика, пока Заказчик письменно не уведомил Исполнителя об компрометации доступа.</w:t>
       </w:r>
     </w:p>
     <w:p>
@@ -391,7 +412,7 @@
           <w:color w:val="000000"/>
           <w:sz w:val="24"/>
         </w:rPr>
-        <w:t>3.3. По исчерпании Пакета Обогащение не выполняется либо выполняется на условиях сверхлимитной тарификации, если такие условия предусмотрены Приложением 1.</w:t>
+        <w:t>3.3. Количество пользователей Личного кабинета: [одна учётная запись / до _____ учётных записей]. Роль в Сервисе — «Заказчик», если иное не согласовано письменно.</w:t>
       </w:r>
     </w:p>
     <w:p>
@@ -408,7 +429,7 @@
           <w:color w:val="000000"/>
           <w:sz w:val="24"/>
         </w:rPr>
-        <w:t>3.4. В расход Пакета включаются SKU, по которым Обогащение в Расчётном периоде завершено [со статусом успешного заполнения / с записью в справочник]. Повторная обработка той же SKU в пределах Расчётного периода [включается / не включается] в расход Пакета. SKU, обработка которых завершилась ошибкой, [включаются / не включаются] в расход Пакета.</w:t>
+        <w:t>3.4. Исполнитель вправе обновлять Сервис без отдельного согласия Заказчика, если это не сужает оплаченный объём Пакета.</w:t>
       </w:r>
     </w:p>
     <w:p>
@@ -425,7 +446,24 @@
           <w:color w:val="000000"/>
           <w:sz w:val="24"/>
         </w:rPr>
-        <w:t>3.5. Неиспользованный в Расчётном периоде остаток Пакета [сгорает / переносится в следующий Расчётный период].</w:t>
+        <w:t>3.5. Требования к файлу Excel (состав колонок, кодировка, размер) публикуются в Личном кабинете и (или) направляются Заказчику. Файл, не соответствующий требованиям, может быть отклонён без расхода Пакета либо возвращён на доработку.</w:t>
+      </w:r>
+    </w:p>
+    <w:p>
+      <w:pPr>
+        <w:spacing w:before="240" w:after="160"/>
+        <w:ind w:firstLine="0"/>
+        <w:jc w:val="center"/>
+      </w:pPr>
+      <w:r>
+        <w:rPr>
+          <w:rFonts w:ascii="Times New Roman" w:hAnsi="Times New Roman" w:eastAsia="Times New Roman"/>
+          <w:b/>
+          <w:i w:val="0"/>
+          <w:color w:val="000000"/>
+          <w:sz w:val="24"/>
+        </w:rPr>
+        <w:t>4. ПОРЯДОК ОБОГАЩЕНИЯ</w:t>
       </w:r>
     </w:p>
     <w:p>
@@ -442,7 +480,75 @@
           <w:color w:val="000000"/>
           <w:sz w:val="24"/>
         </w:rPr>
-        <w:t>3.6. Территория использования Продукта: [Российская Федерация / территория, указанная в Договоре].</w:t>
+        <w:t>4.1. Заказчик загружает в Личный кабинет актуальный номенклатурный справочник (полная загрузка справочника). Повторная загрузка того же справочника не создаёт дублирующие SKU при совпадении внутреннего кода.</w:t>
+      </w:r>
+    </w:p>
+    <w:p>
+      <w:pPr>
+        <w:spacing w:after="120" w:before="0" w:line="240" w:lineRule="auto"/>
+        <w:ind w:firstLine="709"/>
+        <w:jc w:val="both"/>
+      </w:pPr>
+      <w:r>
+        <w:rPr>
+          <w:rFonts w:ascii="Times New Roman" w:hAnsi="Times New Roman" w:eastAsia="Times New Roman"/>
+          <w:b w:val="0"/>
+          <w:i w:val="0"/>
+          <w:color w:val="000000"/>
+          <w:sz w:val="24"/>
+        </w:rPr>
+        <w:t>4.2. Сервис обрабатывает SKU в пределах оплаченного Пакета. Позиции сверх Пакета не обрабатываются либо обрабатываются на условиях сверхлимита по Приложению 1.</w:t>
+      </w:r>
+    </w:p>
+    <w:p>
+      <w:pPr>
+        <w:spacing w:after="120" w:before="0" w:line="240" w:lineRule="auto"/>
+        <w:ind w:firstLine="709"/>
+        <w:jc w:val="both"/>
+      </w:pPr>
+      <w:r>
+        <w:rPr>
+          <w:rFonts w:ascii="Times New Roman" w:hAnsi="Times New Roman" w:eastAsia="Times New Roman"/>
+          <w:b w:val="0"/>
+          <w:i w:val="0"/>
+          <w:color w:val="000000"/>
+          <w:sz w:val="24"/>
+        </w:rPr>
+        <w:t>4.3. При наличии одновременно Валидированного и Типового вариантов в справочник (результат) записывается вариант, утверждённый Заказчиком в Личном кабинете. При отсутствии конфликта вариантов Сервис записывает значение без отдельного утверждения. Заказчик вправе изменить данные вручную в Личном кабинете.</w:t>
+      </w:r>
+    </w:p>
+    <w:p>
+      <w:pPr>
+        <w:spacing w:after="120" w:before="0" w:line="240" w:lineRule="auto"/>
+        <w:ind w:firstLine="709"/>
+        <w:jc w:val="both"/>
+      </w:pPr>
+      <w:r>
+        <w:rPr>
+          <w:rFonts w:ascii="Times New Roman" w:hAnsi="Times New Roman" w:eastAsia="Times New Roman"/>
+          <w:b w:val="0"/>
+          <w:i w:val="0"/>
+          <w:color w:val="000000"/>
+          <w:sz w:val="24"/>
+        </w:rPr>
+        <w:t>4.4. Результат предоставляется в Личном кабинете: отображение сравнения ВГХ и фото «было / стало», статусы обработки, выгрузка обогащённого файла Excel и (или) передача в SpacePlanner согласованным способом, если такая передача доступна на дату оказания.</w:t>
+      </w:r>
+    </w:p>
+    <w:p>
+      <w:pPr>
+        <w:spacing w:after="120" w:before="0" w:line="240" w:lineRule="auto"/>
+        <w:ind w:firstLine="709"/>
+        <w:jc w:val="both"/>
+      </w:pPr>
+      <w:r>
+        <w:rPr>
+          <w:rFonts w:ascii="Times New Roman" w:hAnsi="Times New Roman" w:eastAsia="Times New Roman"/>
+          <w:b w:val="0"/>
+          <w:i w:val="0"/>
+          <w:color w:val="000000"/>
+          <w:sz w:val="24"/>
+        </w:rPr>
+        <w:t>4.5. Ориентировочный срок Обогащения согласованного объёма в пределах Пакета — [часы / рабочие дни] с момента успешной загрузки файла, соответствующего требованиям. Срок не является штрафной гарантией, пока не согласован SLA.</w:t>
       </w:r>
     </w:p>
     <w:p>
@@ -459,7 +565,7 @@
           <w:color w:val="000000"/>
           <w:sz w:val="24"/>
         </w:rPr>
-        <w:t>4. ПОРЯДОК ИСПОЛЬЗОВАНИЯ</w:t>
+        <w:t>5. ТАРИФ</w:t>
       </w:r>
     </w:p>
     <w:p>
@@ -476,7 +582,7 @@
           <w:color w:val="000000"/>
           <w:sz w:val="24"/>
         </w:rPr>
-        <w:t>4.1. Лицензиат обеспечивает загрузку справочника товаров согласованным Сторонами способом (файл установленного формата и (или) программный интерфейс — API).</w:t>
+        <w:t>5.1. Стоимость доступа к Сервису и Обогащения определяется Пакетом по Приложению 1. Пример (не оферта): 10 000 SKU за Расчётный период — 100 000 (Сто тысяч) рублей 00 копеек.</w:t>
       </w:r>
     </w:p>
     <w:p>
@@ -493,7 +599,7 @@
           <w:color w:val="000000"/>
           <w:sz w:val="24"/>
         </w:rPr>
-        <w:t>4.2. Повторная загрузка того же справочника не создаёт дублирующие SKU при совпадении внутреннего кода позиции.</w:t>
+        <w:t>5.2. В расход Пакета включаются SKU, по которым Обогащение завершено с записью результата (включая запись после утверждения варианта). [Повторная обработка той же SKU в периоде: входит / не входит. Ошибки обработки: входят / не входят.]</w:t>
       </w:r>
     </w:p>
     <w:p>
@@ -510,7 +616,24 @@
           <w:color w:val="000000"/>
           <w:sz w:val="24"/>
         </w:rPr>
-        <w:t>4.3. При наличии одновременно Валидированного и Типового вариантов ВГХ в справочник записывается вариант, утверждённый уполномоченным лицом Лицензиата. При отсутствии конфликта вариантов Продукт записывает предложенное значение без отдельного утверждения. Лицензиат вправе в любой момент изменить записанные данные вручную.</w:t>
+        <w:t>5.3. Неиспользованный остаток Пакета [сгорает / переносится].</w:t>
+      </w:r>
+    </w:p>
+    <w:p>
+      <w:pPr>
+        <w:spacing w:before="240" w:after="160"/>
+        <w:ind w:firstLine="0"/>
+        <w:jc w:val="center"/>
+      </w:pPr>
+      <w:r>
+        <w:rPr>
+          <w:rFonts w:ascii="Times New Roman" w:hAnsi="Times New Roman" w:eastAsia="Times New Roman"/>
+          <w:b/>
+          <w:i w:val="0"/>
+          <w:color w:val="000000"/>
+          <w:sz w:val="24"/>
+        </w:rPr>
+        <w:t>6. РЕЗУЛЬТАТ И ОГРАНИЧЕНИЯ</w:t>
       </w:r>
     </w:p>
     <w:p>
@@ -527,7 +650,24 @@
           <w:color w:val="000000"/>
           <w:sz w:val="24"/>
         </w:rPr>
-        <w:t>4.4. Срок Обогащения согласованного объёма SKU в пределах Пакета составляет ориентировочно [указать: часы / рабочие дни] с момента загрузки справочника и не является штрафной гарантией, пока Сторонами не согласован отдельный уровень сервиса (SLA).</w:t>
+        <w:t>6.1. Под качественными ВГХ и фото понимаются характеристики и изображение единицы товара, которая фактически продаётся и размещается на полке, а не транспортной упаковки.</w:t>
+      </w:r>
+    </w:p>
+    <w:p>
+      <w:pPr>
+        <w:spacing w:after="120" w:before="0" w:line="240" w:lineRule="auto"/>
+        <w:ind w:firstLine="709"/>
+        <w:jc w:val="both"/>
+      </w:pPr>
+      <w:r>
+        <w:rPr>
+          <w:rFonts w:ascii="Times New Roman" w:hAnsi="Times New Roman" w:eastAsia="Times New Roman"/>
+          <w:b w:val="0"/>
+          <w:i w:val="0"/>
+          <w:color w:val="000000"/>
+          <w:sz w:val="24"/>
+        </w:rPr>
+        <w:t>6.2. Исполнитель не гарантирует совпадение результата с измерениями средствами измерений и не отвечает за решения Заказчика по ассортименту и выкладке, принятые на основании неутверждённых либо вручную изменённых данных.</w:t>
       </w:r>
     </w:p>
     <w:p>
@@ -544,7 +684,7 @@
           <w:color w:val="000000"/>
           <w:sz w:val="24"/>
         </w:rPr>
-        <w:t>5. РЕЗУЛЬТАТ И ОГРАНИЧЕНИЯ</w:t>
+        <w:t>7. ДАННЫЕ</w:t>
       </w:r>
     </w:p>
     <w:p>
@@ -561,7 +701,7 @@
           <w:color w:val="000000"/>
           <w:sz w:val="24"/>
         </w:rPr>
-        <w:t>5.1. Под качественными ВГХ и фотоизображениями в смысле Продукта понимаются характеристики и изображение единицы товара, которая фактически продаётся и размещается на полке, а не характеристики транспортной (отгрузочной) упаковки и не характеристики иного дизайна упаковки.</w:t>
+        <w:t>7.1. Файлы справочника и результаты Обогащения — информация Заказчика. Исполнитель обрабатывает их для исполнения Соглашения, обеспечивает доступ через Личный кабинет и не передаёт идентифицируемый справочник Заказчика третьим лицам, кроме случаев, установленных законом и Договором.</w:t>
       </w:r>
     </w:p>
     <w:p>
@@ -578,7 +718,7 @@
           <w:color w:val="000000"/>
           <w:sz w:val="24"/>
         </w:rPr>
-        <w:t>5.2. Продукт отображает сравнение исходных значений ВГХ и фото («было») и значений, предложенных или записанных Продуктом («стало»). Указанное сравнение предназначено для контроля Лицензиатом результата Обогащения.</w:t>
+        <w:t>7.2. Использование данных Заказчика для улучшения Сервиса, в том числе в обезличенном виде, [разрешается / не разрешается] — указать по решению Исполнителя.</w:t>
       </w:r>
     </w:p>
     <w:p>
@@ -595,7 +735,7 @@
           <w:color w:val="000000"/>
           <w:sz w:val="24"/>
         </w:rPr>
-        <w:t>5.3. Использование результата Обогащения [только в SpacePlanner / также в иных информационных системах Лицензиата].</w:t>
+        <w:t>7.3. Условия конфиденциальности Договора применяются к Соглашению.</w:t>
       </w:r>
     </w:p>
     <w:p>
@@ -612,7 +752,7 @@
           <w:color w:val="000000"/>
           <w:sz w:val="24"/>
         </w:rPr>
-        <w:t>6. ДАННЫЕ И КОНФИДЕНЦИАЛЬНОСТЬ</w:t>
+        <w:t>8. ВОЗНАГРАЖДЕНИЕ</w:t>
       </w:r>
     </w:p>
     <w:p>
@@ -629,7 +769,7 @@
           <w:color w:val="000000"/>
           <w:sz w:val="24"/>
         </w:rPr>
-        <w:t>6.1. Справочник товаров и результаты Обогащения являются информацией Лицензиата. Лицензиар обрабатывает их исключительно в целях исполнения Соглашения и Договора.</w:t>
+        <w:t>8.1. НДС: [не облагается на основании … / облагается по ставке … %]. Внимание: формулировку «как в лицензии на SpacePlanner» не копировать автоматически — предмет Соглашения иной (доступ к сервису).</w:t>
       </w:r>
     </w:p>
     <w:p>
@@ -646,7 +786,7 @@
           <w:color w:val="000000"/>
           <w:sz w:val="24"/>
         </w:rPr>
-        <w:t>6.2. Использование данных Лицензиата для улучшения алгоритмов Продукта, в том числе в обезличенном виде, [разрешается / не разрешается]. Идентифицируемая передача справочника Лицензиата третьим лицам не допускается, за исключением случаев, предусмотренных законом и Договором.</w:t>
+        <w:t>8.2. Оплата 100 % стоимости Пакета по счёту Исполнителя в течение _____ банковских дней с даты счёта, если иное не согласовано письменно.</w:t>
       </w:r>
     </w:p>
     <w:p>
@@ -663,7 +803,7 @@
           <w:color w:val="000000"/>
           <w:sz w:val="24"/>
         </w:rPr>
-        <w:t>6.3. Условия конфиденциальности Договора распространяются на настоящее Соглашение.</w:t>
+        <w:t>8.3. Исполнитель направляет акт оказанных услуг (УПД) за Расчётный период. Услуги считаются принятыми, если Заказчик не направил мотивированный отказ в течение _____ рабочих дней.</w:t>
       </w:r>
     </w:p>
     <w:p>
@@ -680,7 +820,7 @@
           <w:color w:val="000000"/>
           <w:sz w:val="24"/>
         </w:rPr>
-        <w:t>7. ВОЗНАГРАЖДЕНИЕ И РАСЧЁТЫ</w:t>
+        <w:t>9. СРОК И СВЯЗЬ С ДОГОВОРОМ</w:t>
       </w:r>
     </w:p>
     <w:p>
@@ -697,7 +837,7 @@
           <w:color w:val="000000"/>
           <w:sz w:val="24"/>
         </w:rPr>
-        <w:t>7.1. Вознаграждение НДС не облагается на основании [перенести формулировку из Договора о лицензии SpacePlanner].</w:t>
+        <w:t>9.1. Соглашение действует с даты подписания до [окончания срока лицензии SpacePlanner / даты __________].</w:t>
       </w:r>
     </w:p>
     <w:p>
@@ -714,7 +854,7 @@
           <w:color w:val="000000"/>
           <w:sz w:val="24"/>
         </w:rPr>
-        <w:t>7.2. Оплата производится в размере 100 (Ста) процентов стоимости выбранного Пакета на основании счёта Лицензиара в течение _____ (__________) банковских дней с даты выставления счёта, если иной порядок не согласован Сторонами письменно.</w:t>
+        <w:t>9.2. Прекращение Договора в части SpacePlanner [влечёт / не влечёт] прекращение доступа к Сервису. Исполнитель вправе отключить Личный кабинет по окончании оплаченного Пакета либо срока Соглашения.</w:t>
       </w:r>
     </w:p>
     <w:p>
@@ -731,7 +871,7 @@
           <w:color w:val="000000"/>
           <w:sz w:val="24"/>
         </w:rPr>
-        <w:t>7.3. Документы, подтверждающие предоставление права (акт, УПД либо иной документ, применяемый Сторонами по Договору), оформляются [за Расчётный период / в порядке, установленном Договором].</w:t>
+        <w:t>9.3. В части, не урегулированной Соглашением, применяется Договор (претензии, право, споры). При противоречии в отношении Сервиса применяется Соглашение.</w:t>
       </w:r>
     </w:p>
     <w:p>
@@ -748,7 +888,7 @@
           <w:color w:val="000000"/>
           <w:sz w:val="24"/>
         </w:rPr>
-        <w:t>8. СРОК ДЕЙСТВИЯ И СООТНОШЕНИЕ С ДОГОВОРОМ</w:t>
+        <w:t>10. ОТВЕТСТВЕННОСТЬ</w:t>
       </w:r>
     </w:p>
     <w:p>
@@ -765,7 +905,7 @@
           <w:color w:val="000000"/>
           <w:sz w:val="24"/>
         </w:rPr>
-        <w:t>8.1. Соглашение вступает в силу с даты его подписания Сторонами и действует до [окончания срока лицензии SpacePlanner по Договору / «___» ____________ 20___ г.].</w:t>
+        <w:t>10.1. Совокупная ответственность Исполнителя по Соглашению не превышает сумму, уплаченную Заказчиком за Пакет в Расчётном периоде, в котором возникло основание требования.</w:t>
       </w:r>
     </w:p>
     <w:p>
@@ -782,7 +922,24 @@
           <w:color w:val="000000"/>
           <w:sz w:val="24"/>
         </w:rPr>
-        <w:t>8.2. Прекращение (расторжение) Договора в части SpacePlanner [влечёт / не влечёт] прекращение права использования Продукта по настоящему Соглашению.</w:t>
+        <w:t>10.2. Исполнитель не отвечает за недоступность Сервиса по причинам, зависящим от сети Заказчика, качества исходного файла и действий третьих лиц (хостинг-сбои сверх разумного контроля).</w:t>
+      </w:r>
+    </w:p>
+    <w:p>
+      <w:pPr>
+        <w:spacing w:before="240" w:after="160"/>
+        <w:ind w:firstLine="0"/>
+        <w:jc w:val="center"/>
+      </w:pPr>
+      <w:r>
+        <w:rPr>
+          <w:rFonts w:ascii="Times New Roman" w:hAnsi="Times New Roman" w:eastAsia="Times New Roman"/>
+          <w:b/>
+          <w:i w:val="0"/>
+          <w:color w:val="000000"/>
+          <w:sz w:val="24"/>
+        </w:rPr>
+        <w:t>11. ЗАКЛЮЧИТЕЛЬНЫЕ ПОЛОЖЕНИЯ</w:t>
       </w:r>
     </w:p>
     <w:p>
@@ -799,7 +956,7 @@
           <w:color w:val="000000"/>
           <w:sz w:val="24"/>
         </w:rPr>
-        <w:t>8.3. Во всём, что не урегулировано Соглашением, Стороны руководствуются Договором, включая порядок направления претензий, применимое право и разрешение споров.</w:t>
+        <w:t>11.1. Приложения: Приложение 1 «Тарифы (пакеты SKU)»; Приложение 2 «Описание Сервиса».</w:t>
       </w:r>
     </w:p>
     <w:p>
@@ -816,12 +973,12 @@
           <w:color w:val="000000"/>
           <w:sz w:val="24"/>
         </w:rPr>
-        <w:t>8.4. В случае противоречия между Соглашением и Договором в отношении Продукта применяются условия Соглашения.</w:t>
+        <w:t>11.2. Соглашение составлено в двух экземплярах, по одному для каждой Стороны. Допускается подписание в порядке обмена юридически значимыми сообщениями, установленном Договором.</w:t>
       </w:r>
     </w:p>
     <w:p>
       <w:pPr>
-        <w:spacing w:before="240" w:after="160"/>
+        <w:spacing w:after="120" w:before="240" w:line="240" w:lineRule="auto"/>
         <w:ind w:firstLine="0"/>
         <w:jc w:val="center"/>
       </w:pPr>
@@ -833,108 +990,7 @@
           <w:color w:val="000000"/>
           <w:sz w:val="24"/>
         </w:rPr>
-        <w:t>9. ОТВЕТСТВЕННОСТЬ</w:t>
-      </w:r>
-    </w:p>
-    <w:p>
-      <w:pPr>
-        <w:spacing w:after="120" w:before="0" w:line="240" w:lineRule="auto"/>
-        <w:ind w:firstLine="709"/>
-        <w:jc w:val="both"/>
-      </w:pPr>
-      <w:r>
-        <w:rPr>
-          <w:rFonts w:ascii="Times New Roman" w:hAnsi="Times New Roman" w:eastAsia="Times New Roman"/>
-          <w:b w:val="0"/>
-          <w:i w:val="0"/>
-          <w:color w:val="000000"/>
-          <w:sz w:val="24"/>
-        </w:rPr>
-        <w:t>9.1. Лицензиар не несёт ответственности за убытки Лицензиата, возникшие вследствие решений по ассортименту и выкладке, принятых на основании данных, не утверждённых Лицензиатом либо изменённых Лицензиатом вручную, а также вследствие использования результата Обогащения в качестве данных натурного обмера.</w:t>
-      </w:r>
-    </w:p>
-    <w:p>
-      <w:pPr>
-        <w:spacing w:after="120" w:before="0" w:line="240" w:lineRule="auto"/>
-        <w:ind w:firstLine="709"/>
-        <w:jc w:val="both"/>
-      </w:pPr>
-      <w:r>
-        <w:rPr>
-          <w:rFonts w:ascii="Times New Roman" w:hAnsi="Times New Roman" w:eastAsia="Times New Roman"/>
-          <w:b w:val="0"/>
-          <w:i w:val="0"/>
-          <w:color w:val="000000"/>
-          <w:sz w:val="24"/>
-        </w:rPr>
-        <w:t>9.2. Совокупный размер ответственности Лицензиара по требованиям, связанным с исполнением настоящего Соглашения, не может превышать сумму вознаграждения, фактически уплаченного Лицензиатом за Пакет в Расчётном периоде, в котором возникло основание требования.</w:t>
-      </w:r>
-    </w:p>
-    <w:p>
-      <w:pPr>
-        <w:spacing w:before="240" w:after="160"/>
-        <w:ind w:firstLine="0"/>
-        <w:jc w:val="center"/>
-      </w:pPr>
-      <w:r>
-        <w:rPr>
-          <w:rFonts w:ascii="Times New Roman" w:hAnsi="Times New Roman" w:eastAsia="Times New Roman"/>
-          <w:b/>
-          <w:i w:val="0"/>
-          <w:color w:val="000000"/>
-          <w:sz w:val="24"/>
-        </w:rPr>
-        <w:t>10. ЗАКЛЮЧИТЕЛЬНЫЕ ПОЛОЖЕНИЯ</w:t>
-      </w:r>
-    </w:p>
-    <w:p>
-      <w:pPr>
-        <w:spacing w:after="120" w:before="0" w:line="240" w:lineRule="auto"/>
-        <w:ind w:firstLine="709"/>
-        <w:jc w:val="both"/>
-      </w:pPr>
-      <w:r>
-        <w:rPr>
-          <w:rFonts w:ascii="Times New Roman" w:hAnsi="Times New Roman" w:eastAsia="Times New Roman"/>
-          <w:b w:val="0"/>
-          <w:i w:val="0"/>
-          <w:color w:val="000000"/>
-          <w:sz w:val="24"/>
-        </w:rPr>
-        <w:t>10.1. Неотъемлемой частью Соглашения являются: Приложение 1 «Тарифы (пакеты SKU)»; Приложение 2 «Краткое описание Продукта».</w:t>
-      </w:r>
-    </w:p>
-    <w:p>
-      <w:pPr>
-        <w:spacing w:after="120" w:before="0" w:line="240" w:lineRule="auto"/>
-        <w:ind w:firstLine="709"/>
-        <w:jc w:val="both"/>
-      </w:pPr>
-      <w:r>
-        <w:rPr>
-          <w:rFonts w:ascii="Times New Roman" w:hAnsi="Times New Roman" w:eastAsia="Times New Roman"/>
-          <w:b w:val="0"/>
-          <w:i w:val="0"/>
-          <w:color w:val="000000"/>
-          <w:sz w:val="24"/>
-        </w:rPr>
-        <w:t>10.2. Соглашение составлено в двух экземплярах, имеющих одинаковую юридическую силу, по одному для каждой из Сторон. Допускается подписание в порядке, установленном Договором для обмена юридически значимыми сообщениями, в том числе посредством электронной почты и (или) электронного документооборота, если такой порядок предусмотрен Договором.</w:t>
-      </w:r>
-    </w:p>
-    <w:p>
-      <w:pPr>
-        <w:spacing w:after="120" w:before="240" w:line="240" w:lineRule="auto"/>
-        <w:jc w:val="center"/>
-      </w:pPr>
-      <w:r>
-        <w:rPr>
-          <w:rFonts w:ascii="Times New Roman" w:hAnsi="Times New Roman" w:eastAsia="Times New Roman"/>
-          <w:b/>
-          <w:i w:val="0"/>
-          <w:color w:val="000000"/>
-          <w:sz w:val="24"/>
-        </w:rPr>
-        <w:t>11. АДРЕСА, РЕКВИЗИТЫ И ПОДПИСИ СТОРОН</w:t>
+        <w:t>12. РЕКВИЗИТЫ И ПОДПИСИ СТОРОН</w:t>
       </w:r>
     </w:p>
     <w:tbl>
@@ -955,16 +1011,17 @@
           <w:p>
             <w:pPr>
               <w:ind w:firstLine="0"/>
+              <w:jc w:val="center"/>
             </w:pPr>
             <w:r>
               <w:rPr>
                 <w:rFonts w:ascii="Times New Roman" w:hAnsi="Times New Roman" w:eastAsia="Times New Roman"/>
-                <w:b w:val="0"/>
+                <w:b/>
                 <w:i w:val="0"/>
                 <w:color w:val="000000"/>
                 <w:sz w:val="22"/>
               </w:rPr>
-              <w:t>ЛИЦЕНЗИАР</w:t>
+              <w:t>ИСПОЛНИТЕЛЬ</w:t>
             </w:r>
           </w:p>
         </w:tc>
@@ -975,16 +1032,17 @@
           <w:p>
             <w:pPr>
               <w:ind w:firstLine="0"/>
+              <w:jc w:val="center"/>
             </w:pPr>
             <w:r>
               <w:rPr>
                 <w:rFonts w:ascii="Times New Roman" w:hAnsi="Times New Roman" w:eastAsia="Times New Roman"/>
-                <w:b w:val="0"/>
+                <w:b/>
                 <w:i w:val="0"/>
                 <w:color w:val="000000"/>
                 <w:sz w:val="22"/>
               </w:rPr>
-              <w:t>ЛИЦЕНЗИАТ</w:t>
+              <w:t>ЗАКАЗЧИК</w:t>
             </w:r>
           </w:p>
         </w:tc>
@@ -1021,6 +1079,8 @@
               <w:t>К/с: ____________________</w:t>
               <w:br/>
               <w:t>БИК: ____________________</w:t>
+              <w:br/>
+              <w:t>E-mail для доступа к кабинету: ____________________</w:t>
               <w:br/>
               <w:br/>
               <w:t>________________ / ________________</w:t>
@@ -1061,6 +1121,8 @@
               <w:br/>
               <w:t>БИК: ____________________</w:t>
               <w:br/>
+              <w:t>E-mail для доступа к кабинету: ____________________</w:t>
+              <w:br/>
               <w:br/>
               <w:t>________________ / ________________</w:t>
               <w:br/>
@@ -1078,6 +1140,7 @@
     <w:p>
       <w:pPr>
         <w:spacing w:after="120" w:before="0" w:line="240" w:lineRule="auto"/>
+        <w:ind w:firstLine="0"/>
         <w:jc w:val="center"/>
       </w:pPr>
       <w:r>
@@ -1094,6 +1157,7 @@
     <w:p>
       <w:pPr>
         <w:spacing w:after="120" w:before="0" w:line="240" w:lineRule="auto"/>
+        <w:ind w:firstLine="0"/>
         <w:jc w:val="center"/>
       </w:pPr>
       <w:r>
@@ -1110,6 +1174,7 @@
     <w:p>
       <w:pPr>
         <w:spacing w:after="120" w:before="160" w:line="240" w:lineRule="auto"/>
+        <w:ind w:firstLine="0"/>
         <w:jc w:val="center"/>
       </w:pPr>
       <w:r>
@@ -1126,6 +1191,7 @@
     <w:p>
       <w:pPr>
         <w:spacing w:after="120" w:before="0" w:line="240" w:lineRule="auto"/>
+        <w:ind w:firstLine="0"/>
         <w:jc w:val="both"/>
       </w:pPr>
       <w:r>
@@ -1136,7 +1202,7 @@
           <w:color w:val="000000"/>
           <w:sz w:val="24"/>
         </w:rPr>
-        <w:t>Вознаграждение НДС не облагается на основании формулировки Договора (лицензия SpacePlanner).</w:t>
+        <w:t>Расчётный период: ____________________. НДС: указать отдельно от лицензии SpacePlanner.</w:t>
       </w:r>
     </w:p>
     <w:tbl>
@@ -1167,7 +1233,7 @@
                 <w:color w:val="000000"/>
                 <w:sz w:val="22"/>
               </w:rPr>
-              <w:t>Пакет (количество SKU за Расчётный период)</w:t>
+              <w:t>Пакет SKU за Расчётный период</w:t>
             </w:r>
           </w:p>
         </w:tc>
@@ -1187,7 +1253,7 @@
                 <w:color w:val="000000"/>
                 <w:sz w:val="22"/>
               </w:rPr>
-              <w:t>Вознаграждение, руб.</w:t>
+              <w:t>Стоимость, руб.</w:t>
             </w:r>
           </w:p>
         </w:tc>
@@ -1269,7 +1335,7 @@
                 <w:color w:val="000000"/>
                 <w:sz w:val="22"/>
               </w:rPr>
-              <w:t>Пример; заменить на утверждённую сетку</w:t>
+              <w:t>Пример</w:t>
             </w:r>
           </w:p>
         </w:tc>
@@ -1413,7 +1479,7 @@
                 <w:color w:val="000000"/>
                 <w:sz w:val="22"/>
               </w:rPr>
-              <w:t>Сверхлимит (1 SKU)</w:t>
+              <w:t>Сверхлимит за 1 SKU</w:t>
             </w:r>
           </w:p>
         </w:tc>
@@ -1453,7 +1519,7 @@
                 <w:color w:val="000000"/>
                 <w:sz w:val="22"/>
               </w:rPr>
-              <w:t>Заполнить либо указать «не применяется»</w:t>
+              <w:t>Либо «не применяется»</w:t>
             </w:r>
           </w:p>
         </w:tc>
@@ -1461,7 +1527,8 @@
     </w:tbl>
     <w:p>
       <w:pPr>
-        <w:spacing w:after="80" w:before="0" w:line="240" w:lineRule="auto"/>
+        <w:spacing w:after="120" w:before="200" w:line="240" w:lineRule="auto"/>
+        <w:ind w:firstLine="0"/>
         <w:jc w:val="both"/>
       </w:pPr>
       <w:r>
@@ -1472,27 +1539,13 @@
           <w:color w:val="000000"/>
           <w:sz w:val="24"/>
         </w:rPr>
-      </w:r>
-    </w:p>
-    <w:p>
-      <w:pPr>
-        <w:spacing w:after="120" w:before="0" w:line="240" w:lineRule="auto"/>
-        <w:jc w:val="both"/>
-      </w:pPr>
-      <w:r>
-        <w:rPr>
-          <w:rFonts w:ascii="Times New Roman" w:hAnsi="Times New Roman" w:eastAsia="Times New Roman"/>
-          <w:b w:val="0"/>
-          <w:i w:val="0"/>
-          <w:color w:val="000000"/>
-          <w:sz w:val="24"/>
-        </w:rPr>
-        <w:t>Расчётный период: ____________________. Остаток Пакета: сгорает / переносится (нужное оставить). Повторная обработка той же SKU: входит / не входит в расход Пакета (нужное оставить).</w:t>
+        <w:t>Остаток Пакета: сгорает / переносится. Повторная обработка той же SKU: входит / не входит в расход.</w:t>
       </w:r>
     </w:p>
     <w:p>
       <w:pPr>
         <w:spacing w:after="120" w:before="360" w:line="240" w:lineRule="auto"/>
+        <w:ind w:firstLine="0"/>
         <w:jc w:val="left"/>
       </w:pPr>
       <w:r>
@@ -1503,7 +1556,7 @@
           <w:color w:val="000000"/>
           <w:sz w:val="24"/>
         </w:rPr>
-        <w:t>Лицензиар ________________ / __________     Лицензиат ________________ / __________</w:t>
+        <w:t>Исполнитель ________________ / __________     Заказчик ________________ / __________</w:t>
       </w:r>
     </w:p>
     <w:p>
@@ -1514,6 +1567,7 @@
     <w:p>
       <w:pPr>
         <w:spacing w:after="120" w:before="0" w:line="240" w:lineRule="auto"/>
+        <w:ind w:firstLine="0"/>
         <w:jc w:val="center"/>
       </w:pPr>
       <w:r>
@@ -1530,6 +1584,7 @@
     <w:p>
       <w:pPr>
         <w:spacing w:after="120" w:before="0" w:line="240" w:lineRule="auto"/>
+        <w:ind w:firstLine="0"/>
         <w:jc w:val="center"/>
       </w:pPr>
       <w:r>
@@ -1546,6 +1601,7 @@
     <w:p>
       <w:pPr>
         <w:spacing w:after="120" w:before="160" w:line="240" w:lineRule="auto"/>
+        <w:ind w:firstLine="0"/>
         <w:jc w:val="center"/>
       </w:pPr>
       <w:r>
@@ -1556,7 +1612,7 @@
           <w:color w:val="000000"/>
           <w:sz w:val="24"/>
         </w:rPr>
-        <w:t>КРАТКОЕ ОПИСАНИЕ ПРОДУКТА «АВТОКАРТОЧКИ STARTER»</w:t>
+        <w:t>ОПИСАНИЕ СЕРВИСА «АВТОКАРТОЧКИ STARTER»</w:t>
       </w:r>
     </w:p>
     <w:p>
@@ -1573,7 +1629,7 @@
           <w:color w:val="000000"/>
           <w:sz w:val="24"/>
         </w:rPr>
-        <w:t>Продукт обеспечивает обогащение справочника товаров: качественные габариты и фото за понятный срок (часы/дни), а не недели ручного поиска информации и внесения в справочник.</w:t>
+        <w:t>Сервис доступен на Сайте Сервиса в Личном кабинете Заказчика. Заказчик загружает Excel с номенклатурным справочником и получает обогащённые карточки товаров (ВГХ и фото).</w:t>
       </w:r>
     </w:p>
     <w:p>
@@ -1590,7 +1646,7 @@
           <w:color w:val="000000"/>
           <w:sz w:val="24"/>
         </w:rPr>
-        <w:t>Под качественными понимаются габариты и фото единицы товара, которая реально продаётся и лежит на полке в соответствующий момент времени. Это не ВГХ транспортной коробки и не произвольное изображение иной упаковки.</w:t>
+        <w:t>Качественные габариты и фото — единицы товара, которая продаётся и лежит на полке, а не транспортной коробки. При нескольких вариантах Сервис показывает валидированные и типовые; записывается утверждённый Заказчиком вариант.</w:t>
       </w:r>
     </w:p>
     <w:p>
@@ -1607,41 +1663,7 @@
           <w:color w:val="000000"/>
           <w:sz w:val="24"/>
         </w:rPr>
-        <w:t>Если вариантов габаритов несколько, Продукт показывает валидированные и типовые; в справочник записывается утверждённый Лицензиатом вариант. При отсутствии конфликта вариантов значение может быть записано без отдельного утверждения. Данные могут быть изменены Лицензиатом вручную.</w:t>
-      </w:r>
-    </w:p>
-    <w:p>
-      <w:pPr>
-        <w:spacing w:after="120" w:before="0" w:line="240" w:lineRule="auto"/>
-        <w:ind w:firstLine="709"/>
-        <w:jc w:val="both"/>
-      </w:pPr>
-      <w:r>
-        <w:rPr>
-          <w:rFonts w:ascii="Times New Roman" w:hAnsi="Times New Roman" w:eastAsia="Times New Roman"/>
-          <w:b w:val="0"/>
-          <w:i w:val="0"/>
-          <w:color w:val="000000"/>
-          <w:sz w:val="24"/>
-        </w:rPr>
-        <w:t>Продукт отображает сравнение ВГХ и фото «было / стало». Повторная загрузка справочника не создаёт дубли при совпадении внутреннего кода.</w:t>
-      </w:r>
-    </w:p>
-    <w:p>
-      <w:pPr>
-        <w:spacing w:after="120" w:before="0" w:line="240" w:lineRule="auto"/>
-        <w:ind w:firstLine="709"/>
-        <w:jc w:val="both"/>
-      </w:pPr>
-      <w:r>
-        <w:rPr>
-          <w:rFonts w:ascii="Times New Roman" w:hAnsi="Times New Roman" w:eastAsia="Times New Roman"/>
-          <w:b w:val="0"/>
-          <w:i w:val="0"/>
-          <w:color w:val="000000"/>
-          <w:sz w:val="24"/>
-        </w:rPr>
-        <w:t>В контуре SpacePlanner Продукт достраивает недостающие габариты и фото и готовит товары из справочника для создания выкладки в SpacePlanner. Ценность: возможность вести мерчендайзинг при неполных исходных данных по габаритам и фото.</w:t>
+        <w:t>В контуре SpacePlanner Сервис достраивает недостающие габариты и фото и готовит товары для создания выкладки в SpacePlanner.</w:t>
       </w:r>
     </w:p>
     <w:p>
@@ -1658,12 +1680,13 @@
           <w:color w:val="000000"/>
           <w:sz w:val="24"/>
         </w:rPr>
-        <w:t>Автоматическое приведение загруженного справочника к формату SpacePlanner «за короткое время» может находиться в стадии разработки; объём доступного функционала на дату заключения Соглашения подтверждается Лицензиаром письменно либо в интерфейсе Продукта.</w:t>
+        <w:t>Автоматическая передача результата в SpacePlanner «за короткое время» может быть в стадии разработки; доступный состав функций на дату Соглашения подтверждается в Личном кабинете.</w:t>
       </w:r>
     </w:p>
     <w:p>
       <w:pPr>
         <w:spacing w:after="120" w:before="360" w:line="240" w:lineRule="auto"/>
+        <w:ind w:firstLine="0"/>
         <w:jc w:val="left"/>
       </w:pPr>
       <w:r>
@@ -1674,7 +1697,7 @@
           <w:color w:val="000000"/>
           <w:sz w:val="24"/>
         </w:rPr>
-        <w:t>Лицензиар ________________ / __________     Лицензиат ________________ / __________</w:t>
+        <w:t>Исполнитель ________________ / __________     Заказчик ________________ / __________</w:t>
       </w:r>
     </w:p>
     <w:sectPr>

</xml_diff>

<commit_message>
Align Autocards DS template with SP contract VAT, confidentiality and disputes
Co-authored-by: Alena931 <Alena931@users.noreply.github.com>
</commit_message>
<xml_diff>
--- a/DS_Avtokartochki_Starter.docx
+++ b/DS_Avtokartochki_Starter.docx
@@ -2,23 +2,6 @@
 <file path=word/document.xml><?xml version="1.0" encoding="utf-8"?>
 <w:document xmlns:wpc="http://schemas.microsoft.com/office/word/2010/wordprocessingCanvas" xmlns:mo="http://schemas.microsoft.com/office/mac/office/2008/main" xmlns:mc="http://schemas.openxmlformats.org/markup-compatibility/2006" xmlns:mv="urn:schemas-microsoft-com:mac:vml" xmlns:o="urn:schemas-microsoft-com:office:office" xmlns:r="http://schemas.openxmlformats.org/officeDocument/2006/relationships" xmlns:m="http://schemas.openxmlformats.org/officeDocument/2006/math" xmlns:v="urn:schemas-microsoft-com:vml" xmlns:wp14="http://schemas.microsoft.com/office/word/2010/wordprocessingDrawing" xmlns:wp="http://schemas.openxmlformats.org/drawingml/2006/wordprocessingDrawing" xmlns:w10="urn:schemas-microsoft-com:office:word" xmlns:w="http://schemas.openxmlformats.org/wordprocessingml/2006/main" xmlns:w14="http://schemas.microsoft.com/office/word/2010/wordml" xmlns:wpg="http://schemas.microsoft.com/office/word/2010/wordprocessingGroup" xmlns:wpi="http://schemas.microsoft.com/office/word/2010/wordprocessingInk" xmlns:wne="http://schemas.microsoft.com/office/word/2006/wordml" xmlns:wps="http://schemas.microsoft.com/office/word/2010/wordprocessingShape" mc:Ignorable="w14 wp14">
   <w:body>
-    <w:p>
-      <w:pPr>
-        <w:spacing w:after="280" w:before="0" w:line="240" w:lineRule="auto"/>
-        <w:ind w:firstLine="0"/>
-        <w:jc w:val="left"/>
-      </w:pPr>
-      <w:r>
-        <w:rPr>
-          <w:rFonts w:ascii="Times New Roman" w:hAnsi="Times New Roman" w:eastAsia="Times New Roman"/>
-          <w:b w:val="0"/>
-          <w:i/>
-          <w:color w:val="000000"/>
-          <w:sz w:val="20"/>
-        </w:rPr>
-        <w:t>ЧЕРНОВИК ДЛЯ ЮРИСТА. Не является юридическим заключением. Предмет — доступ к онлайн-сервису (личный кабинет), а не лицензия на экземпляр ПО. Льгота «без НДС», применяемая к лицензии SpacePlanner, к доступу к кабинету может не применяться — налоговый режим согласовать отдельно. Цифры пакетов — пример.</w:t>
-      </w:r>
-    </w:p>
     <w:p>
       <w:pPr>
         <w:spacing w:after="80" w:before="0" w:line="240" w:lineRule="auto"/>
@@ -55,7 +38,7 @@
     </w:p>
     <w:p>
       <w:pPr>
-        <w:spacing w:after="280" w:before="0" w:line="240" w:lineRule="auto"/>
+        <w:spacing w:after="160" w:before="0" w:line="240" w:lineRule="auto"/>
         <w:ind w:firstLine="0"/>
         <w:jc w:val="center"/>
       </w:pPr>
@@ -72,45 +55,6 @@
     </w:p>
     <w:p>
       <w:pPr>
-        <w:spacing w:after="240"/>
-        <w:ind w:firstLine="0"/>
-      </w:pPr>
-      <w:r>
-        <w:rPr>
-          <w:rFonts w:ascii="Times New Roman" w:hAnsi="Times New Roman" w:eastAsia="Times New Roman"/>
-          <w:b w:val="0"/>
-          <w:i w:val="0"/>
-          <w:color w:val="000000"/>
-          <w:sz w:val="24"/>
-        </w:rPr>
-        <w:t>г. ____________________</w:t>
-      </w:r>
-      <w:r>
-        <w:rPr>
-          <w:rFonts w:ascii="Times New Roman" w:hAnsi="Times New Roman" w:eastAsia="Times New Roman"/>
-          <w:b w:val="0"/>
-          <w:i w:val="0"/>
-          <w:color w:val="000000"/>
-          <w:sz w:val="24"/>
-        </w:rPr>
-        <w:tab/>
-        <w:tab/>
-        <w:tab/>
-        <w:tab/>
-      </w:r>
-      <w:r>
-        <w:rPr>
-          <w:rFonts w:ascii="Times New Roman" w:hAnsi="Times New Roman" w:eastAsia="Times New Roman"/>
-          <w:b w:val="0"/>
-          <w:i w:val="0"/>
-          <w:color w:val="000000"/>
-          <w:sz w:val="24"/>
-        </w:rPr>
-        <w:t>«___» ____________ 20___ г.</w:t>
-      </w:r>
-    </w:p>
-    <w:p>
-      <w:pPr>
         <w:spacing w:after="120" w:before="0" w:line="240" w:lineRule="auto"/>
         <w:ind w:firstLine="709"/>
         <w:jc w:val="both"/>
@@ -123,7 +67,7 @@
           <w:color w:val="000000"/>
           <w:sz w:val="24"/>
         </w:rPr>
-        <w:t>________________________________________________________________, именуемое в дальнейшем «Исполнитель» (в Договоре — Лицензиар), в лице ________________________________________, действующего на основании ____________________, с одной стороны, и ________________________________________________________________, именуемое в дальнейшем «Заказчик» (в Договоре — Лицензиат), в лице ________________________________________, действующего на основании ____________________, с другой стороны, совместно именуемые «Стороны», заключили настоящее дополнительное соглашение (далее — Соглашение) о нижеследующем.</w:t>
+        <w:t>Стороны Договора заключили настоящее дополнительное соглашение (далее — Соглашение) в соответствии с пунктом 12.7 Договора о нижеследующем.</w:t>
       </w:r>
     </w:p>
     <w:p>
@@ -157,7 +101,7 @@
           <w:color w:val="000000"/>
           <w:sz w:val="24"/>
         </w:rPr>
-        <w:t>1.1. Исполнитель предоставляет Заказчику возмездный доступ к онлайн-сервису «Автокарточки Starter» (далее — Сервис), размещённому в информационно-телекоммуникационной сети «Интернет» по адресу: [https://____________________] (далее — Сайт Сервиса), путём создания личного кабинета Заказчика (учётная запись: логин и пароль).</w:t>
+        <w:t>1.1. Лицензиар предоставляет Лицензиату возмездный доступ к онлайн-сервису «Автокарточки Starter» (далее — Сервис), размещённому в информационно-телекоммуникационной сети «Интернет» по адресу: [https://____________________] (далее — Сайт Сервиса), путём создания личного кабинета Лицензиата (учётная запись: логин и пароль).</w:t>
       </w:r>
     </w:p>
     <w:p>
@@ -174,7 +118,7 @@
           <w:color w:val="000000"/>
           <w:sz w:val="24"/>
         </w:rPr>
-        <w:t>1.2. Функциональное назначение Сервиса: Заказчик загружает в личный кабинет файл в формате Excel с номенклатурным справочником; Исполнитель посредством Сервиса выполняет обогащение карточек товаров (ВГХ единицы товара на полке и фотоизображения) и предоставляет Заказчику результат в личном кабинете (просмотр, выгрузка обогащённого файла и (или) иной согласованный способ).</w:t>
+        <w:t>1.2. Функциональное назначение Сервиса: Лицензиат загружает в личный кабинет файл в формате Excel с номенклатурным справочником; Лицензиар посредством Сервиса выполняет обогащение карточек товаров (ВГХ единицы товара на полке и фотоизображения) и предоставляет Лицензиату результат в личном кабинете (просмотр, выгрузка обогащённого файла и (или) иной согласованный способ).</w:t>
       </w:r>
     </w:p>
     <w:p>
@@ -191,7 +135,7 @@
           <w:color w:val="000000"/>
           <w:sz w:val="24"/>
         </w:rPr>
-        <w:t>1.3. Сервис используется Заказчиком, имеющим действующие права на SpacePlanner по Договору, в том числе для последующей работы с выкладкой в SpacePlanner. Настоящее Соглашение не предоставляет и не изменяет лицензию на SpacePlanner. Доступ к Сервису не является предоставлением экземпляра программы для ЭВМ на материальном носителе и не тождественен лицензии по Договору.</w:t>
+        <w:t>1.3. Сервис используется Лицензиатом, имеющим действующие права на SpacePlanner по Договору, в том числе для последующей работы с выкладкой в SpacePlanner. Настоящее Соглашение не предоставляет и не изменяет лицензию на SpacePlanner. Доступ к Сервису не является предоставлением экземпляра программы для ЭВМ на материальном носителе и не тождественен лицензии по Договору.</w:t>
       </w:r>
     </w:p>
     <w:p>
@@ -208,7 +152,7 @@
           <w:color w:val="000000"/>
           <w:sz w:val="24"/>
         </w:rPr>
-        <w:t>1.4. Сервис не заменяет SpacePlanner и учётную систему Заказчика, не является услугой натурного обмера товара средствами измерений.</w:t>
+        <w:t>1.4. Сервис не заменяет SpacePlanner и учётную систему Лицензиата, не является услугой натурного обмера товара средствами измерений.</w:t>
       </w:r>
     </w:p>
     <w:p>
@@ -259,7 +203,7 @@
           <w:color w:val="000000"/>
           <w:sz w:val="24"/>
         </w:rPr>
-        <w:t>Личный кабинет — защищённый раздел Сайта Сервиса, доступный Заказчику по логину и паролю.</w:t>
+        <w:t>Личный кабинет — защищённый раздел Сайта Сервиса, доступный Лицензиату по логину и паролю.</w:t>
       </w:r>
     </w:p>
     <w:p>
@@ -276,7 +220,7 @@
           <w:color w:val="000000"/>
           <w:sz w:val="24"/>
         </w:rPr>
-        <w:t>SKU — позиция номенклатурного справочника Заказчика, идентифицируемая внутренним кодом Заказчика.</w:t>
+        <w:t>SKU — позиция номенклатурного справочника Лицензиата, идентифицируемая внутренним кодом Лицензиата.</w:t>
       </w:r>
     </w:p>
     <w:p>
@@ -378,7 +322,7 @@
           <w:color w:val="000000"/>
           <w:sz w:val="24"/>
         </w:rPr>
-        <w:t>3.1. В течение _____ (__________) рабочих дней с даты поступления оплаты Пакета (либо с даты подписания Соглашения, если доступ предоставляется до оплаты на условиях отсрочки) Исполнитель направляет Заказчику на адрес электронной почты ____________________ логин и пароль (либо ссылку на самостоятельную регистрацию) и адрес Сайта Сервиса.</w:t>
+        <w:t>3.1. В течение _____ (__________) рабочих дней с даты поступления оплаты Пакета (либо с даты подписания Соглашения, если доступ предоставляется до оплаты на условиях отсрочки) Лицензиар направляет Лицензиату на адрес электронной почты ____________________ логин и пароль (либо ссылку на самостоятельную регистрацию) и адрес Сайта Сервиса.</w:t>
       </w:r>
     </w:p>
     <w:p>
@@ -395,7 +339,7 @@
           <w:color w:val="000000"/>
           <w:sz w:val="24"/>
         </w:rPr>
-        <w:t>3.2. Заказчик обеспечивает сохранность логина и пароля, не передаёт их третьим лицам, за исключением работников Заказчика, допущенных к работе со справочником. Действия, совершённые в Личном кабинете с использованием логина Заказчика, считаются действиями Заказчика, пока Заказчик письменно не уведомил Исполнителя об компрометации доступа.</w:t>
+        <w:t>3.2. Лицензиат обеспечивает сохранность логина и пароля, не передаёт их третьим лицам, за исключением работников Лицензиата, допущенных к работе со справочником. Действия, совершённые в Личном кабинете с использованием логина Лицензиата, считаются действиями Лицензиата, пока Лицензиат письменно не уведомил Лицензиара о компрометации доступа.</w:t>
       </w:r>
     </w:p>
     <w:p>
@@ -429,7 +373,7 @@
           <w:color w:val="000000"/>
           <w:sz w:val="24"/>
         </w:rPr>
-        <w:t>3.4. Исполнитель вправе обновлять Сервис без отдельного согласия Заказчика, если это не сужает оплаченный объём Пакета.</w:t>
+        <w:t>3.4. Лицензиар вправе обновлять Сервис без отдельного согласия Лицензиата, если это не сужает оплаченный объём Пакета.</w:t>
       </w:r>
     </w:p>
     <w:p>
@@ -446,7 +390,7 @@
           <w:color w:val="000000"/>
           <w:sz w:val="24"/>
         </w:rPr>
-        <w:t>3.5. Требования к файлу Excel (состав колонок, кодировка, размер) публикуются в Личном кабинете и (или) направляются Заказчику. Файл, не соответствующий требованиям, может быть отклонён без расхода Пакета либо возвращён на доработку.</w:t>
+        <w:t>3.5. Требования к файлу Excel (состав колонок, кодировка, размер) публикуются в Личном кабинете и (или) направляются Лицензиату. Файл, не соответствующий требованиям, может быть отклонён без расхода Пакета либо возвращён на доработку.</w:t>
       </w:r>
     </w:p>
     <w:p>
@@ -480,7 +424,7 @@
           <w:color w:val="000000"/>
           <w:sz w:val="24"/>
         </w:rPr>
-        <w:t>4.1. Заказчик загружает в Личный кабинет актуальный номенклатурный справочник (полная загрузка справочника). Повторная загрузка того же справочника не создаёт дублирующие SKU при совпадении внутреннего кода.</w:t>
+        <w:t>4.1. Лицензиат загружает в Личный кабинет актуальный номенклатурный справочник (полная загрузка справочника). Повторная загрузка того же справочника не создаёт дублирующие SKU при совпадении внутреннего кода.</w:t>
       </w:r>
     </w:p>
     <w:p>
@@ -514,7 +458,7 @@
           <w:color w:val="000000"/>
           <w:sz w:val="24"/>
         </w:rPr>
-        <w:t>4.3. При наличии одновременно Валидированного и Типового вариантов в справочник (результат) записывается вариант, утверждённый Заказчиком в Личном кабинете. При отсутствии конфликта вариантов Сервис записывает значение без отдельного утверждения. Заказчик вправе изменить данные вручную в Личном кабинете.</w:t>
+        <w:t>4.3. При наличии одновременно Валидированного и Типового вариантов в справочник (результат) записывается вариант, утверждённый Лицензиатом в Личном кабинете. При отсутствии конфликта вариантов Сервис записывает значение без отдельного утверждения. Лицензиат вправе изменить данные вручную в Личном кабинете.</w:t>
       </w:r>
     </w:p>
     <w:p>
@@ -667,7 +611,7 @@
           <w:color w:val="000000"/>
           <w:sz w:val="24"/>
         </w:rPr>
-        <w:t>6.2. Исполнитель не гарантирует совпадение результата с измерениями средствами измерений и не отвечает за решения Заказчика по ассортименту и выкладке, принятые на основании неутверждённых либо вручную изменённых данных.</w:t>
+        <w:t>6.2. Лицензиар не гарантирует совпадение результата с измерениями средствами измерений и не отвечает за решения Лицензиата по ассортименту и выкладке, принятые на основании неутверждённых либо вручную изменённых данных.</w:t>
       </w:r>
     </w:p>
     <w:p>
@@ -701,7 +645,7 @@
           <w:color w:val="000000"/>
           <w:sz w:val="24"/>
         </w:rPr>
-        <w:t>7.1. Файлы справочника и результаты Обогащения — информация Заказчика. Исполнитель обрабатывает их для исполнения Соглашения, обеспечивает доступ через Личный кабинет и не передаёт идентифицируемый справочник Заказчика третьим лицам, кроме случаев, установленных законом и Договором.</w:t>
+        <w:t>7.1. Файлы справочника и результаты Обогащения — информация Лицензиата. Лицензиар обрабатывает их для исполнения Соглашения, обеспечивает доступ через Личный кабинет и не передаёт идентифицируемый справочник Лицензиата третьим лицам, кроме случаев, установленных пунктом 11.3 Договора и законодательством Российской Федерации.</w:t>
       </w:r>
     </w:p>
     <w:p>
@@ -718,7 +662,7 @@
           <w:color w:val="000000"/>
           <w:sz w:val="24"/>
         </w:rPr>
-        <w:t>7.2. Использование данных Заказчика для улучшения Сервиса, в том числе в обезличенном виде, [разрешается / не разрешается] — указать по решению Исполнителя.</w:t>
+        <w:t>7.2. Использование данных Лицензиата для улучшения Сервиса, в том числе в обезличенном виде, [разрешается / не разрешается].</w:t>
       </w:r>
     </w:p>
     <w:p>
@@ -735,7 +679,7 @@
           <w:color w:val="000000"/>
           <w:sz w:val="24"/>
         </w:rPr>
-        <w:t>7.3. Условия конфиденциальности Договора применяются к Соглашению.</w:t>
+        <w:t>7.3. К информации, документации и сведениям, полученным Сторонами в связи с исполнением Соглашения (включая номенклатурный справочник, результаты Обогащения, логины доступа), применяются пункты 11.1–11.5 Договора. Обязанности по пункту 11.1 Договора действуют в течение срока действия Соглашения и 5 (пяти) лет после его окончания (пункт 11.2 Договора).</w:t>
       </w:r>
     </w:p>
     <w:p>
@@ -769,7 +713,7 @@
           <w:color w:val="000000"/>
           <w:sz w:val="24"/>
         </w:rPr>
-        <w:t>8.1. НДС: [не облагается на основании … / облагается по ставке … %]. Внимание: формулировку «как в лицензии на SpacePlanner» не копировать автоматически — предмет Соглашения иной (доступ к сервису).</w:t>
+        <w:t>8.1. Стоимость указана без НДС. НДС не облагается в соответствии с пп. 26 п. 2 ст. 149 НК РФ: программы для электронных вычислительных машин и базы данных, право использования которых передается по Договору, включены в единый реестр российских программ для электронных вычислительных машин и баз данных.</w:t>
       </w:r>
     </w:p>
     <w:p>
@@ -786,7 +730,7 @@
           <w:color w:val="000000"/>
           <w:sz w:val="24"/>
         </w:rPr>
-        <w:t>8.2. Оплата 100 % стоимости Пакета по счёту Исполнителя в течение _____ банковских дней с даты счёта, если иное не согласовано письменно.</w:t>
+        <w:t>8.2. Оплата 100 % стоимости Пакета по счёту Лицензиара в течение _____ банковских дней с даты счёта, если иное не согласовано Сторонами письменно.</w:t>
       </w:r>
     </w:p>
     <w:p>
@@ -803,7 +747,7 @@
           <w:color w:val="000000"/>
           <w:sz w:val="24"/>
         </w:rPr>
-        <w:t>8.3. Исполнитель направляет акт оказанных услуг (УПД) за Расчётный период. Услуги считаются принятыми, если Заказчик не направил мотивированный отказ в течение _____ рабочих дней.</w:t>
+        <w:t>8.3. Лицензиар направляет акт (УПД) за Расчётный период в порядке, применяемом Сторонами по Договору. Результат считается принятым, если Лицензиат не направил мотивированный отказ в течение _____ рабочих дней с даты получения акта (УПД).</w:t>
       </w:r>
     </w:p>
     <w:p>
@@ -820,7 +764,7 @@
           <w:color w:val="000000"/>
           <w:sz w:val="24"/>
         </w:rPr>
-        <w:t>9. СРОК И СВЯЗЬ С ДОГОВОРОМ</w:t>
+        <w:t>9. СРОК И СООТНОШЕНИЕ С ДОГОВОРОМ</w:t>
       </w:r>
     </w:p>
     <w:p>
@@ -837,7 +781,7 @@
           <w:color w:val="000000"/>
           <w:sz w:val="24"/>
         </w:rPr>
-        <w:t>9.1. Соглашение действует с даты подписания до [окончания срока лицензии SpacePlanner / даты __________].</w:t>
+        <w:t>9.1. Настоящее Соглашение является дополнительным соглашением к Договору в смысле пункта 12.7 Договора, оформлено письменно и подлежит подписанию Сторонами.</w:t>
       </w:r>
     </w:p>
     <w:p>
@@ -854,7 +798,7 @@
           <w:color w:val="000000"/>
           <w:sz w:val="24"/>
         </w:rPr>
-        <w:t>9.2. Прекращение Договора в части SpacePlanner [влечёт / не влечёт] прекращение доступа к Сервису. Исполнитель вправе отключить Личный кабинет по окончании оплаченного Пакета либо срока Соглашения.</w:t>
+        <w:t>9.2. Соглашение вступает в силу с даты подписания Сторонами и действует до [окончания срока лицензии на SpacePlanner по Договору / «___» ____________ 20___ г.].</w:t>
       </w:r>
     </w:p>
     <w:p>
@@ -871,7 +815,41 @@
           <w:color w:val="000000"/>
           <w:sz w:val="24"/>
         </w:rPr>
-        <w:t>9.3. В части, не урегулированной Соглашением, применяется Договор (претензии, право, споры). При противоречии в отношении Сервиса применяется Соглашение.</w:t>
+        <w:t>9.3. Прекращение Договора [влечёт / не влечёт] прекращение доступа к Сервису. Лицензиар вправе отключить Личный кабинет по окончании оплаченного Пакета либо срока Соглашения.</w:t>
+      </w:r>
+    </w:p>
+    <w:p>
+      <w:pPr>
+        <w:spacing w:after="120" w:before="0" w:line="240" w:lineRule="auto"/>
+        <w:ind w:firstLine="709"/>
+        <w:jc w:val="both"/>
+      </w:pPr>
+      <w:r>
+        <w:rPr>
+          <w:rFonts w:ascii="Times New Roman" w:hAnsi="Times New Roman" w:eastAsia="Times New Roman"/>
+          <w:b w:val="0"/>
+          <w:i w:val="0"/>
+          <w:color w:val="000000"/>
+          <w:sz w:val="24"/>
+        </w:rPr>
+        <w:t>9.4. Положения пункта 9.4 Договора применяются к Соглашению в той мере, в какой они касаются предшествующих переговоров именно по предмету Соглашения. Подписание Соглашения не отменяет Договор и не лишает силы иные действующие приложения и дополнительные соглашения к Договору, кроме случаев, прямо указанных в Соглашении.</w:t>
+      </w:r>
+    </w:p>
+    <w:p>
+      <w:pPr>
+        <w:spacing w:after="120" w:before="0" w:line="240" w:lineRule="auto"/>
+        <w:ind w:firstLine="709"/>
+        <w:jc w:val="both"/>
+      </w:pPr>
+      <w:r>
+        <w:rPr>
+          <w:rFonts w:ascii="Times New Roman" w:hAnsi="Times New Roman" w:eastAsia="Times New Roman"/>
+          <w:b w:val="0"/>
+          <w:i w:val="0"/>
+          <w:color w:val="000000"/>
+          <w:sz w:val="24"/>
+        </w:rPr>
+        <w:t>9.5. Во всём, что не урегулировано Соглашением, Стороны руководствуются Договором. При противоречии условий Соглашения и Договора в отношении Сервиса применяются условия Соглашения.</w:t>
       </w:r>
     </w:p>
     <w:p>
@@ -888,7 +866,7 @@
           <w:color w:val="000000"/>
           <w:sz w:val="24"/>
         </w:rPr>
-        <w:t>10. ОТВЕТСТВЕННОСТЬ</w:t>
+        <w:t>10. ПРЕТЕНЗИИ И СПОРЫ</w:t>
       </w:r>
     </w:p>
     <w:p>
@@ -905,7 +883,24 @@
           <w:color w:val="000000"/>
           <w:sz w:val="24"/>
         </w:rPr>
-        <w:t>10.1. Совокупная ответственность Исполнителя по Соглашению не превышает сумму, уплаченную Заказчиком за Пакет в Расчётном периоде, в котором возникло основание требования.</w:t>
+        <w:t>10.1. Споры, связанные с заключением, исполнением, изменением, расторжением и действительностью настоящего Соглашения, разрешаются в порядке, установленном пунктами 10.1–10.4 Договора: претензионный порядок; направление претензии по почте с уведомлением о вручении и описью вложения по адресу, указанному в Договоре, или по адресу в ЕГРЮЛ; срок рассмотрения претензии — 15 календарных дней с момента её получения; при недостижении соглашения спор рассматривается в Арбитражном суде города Санкт-Петербурга и Ленинградской области.</w:t>
+      </w:r>
+    </w:p>
+    <w:p>
+      <w:pPr>
+        <w:spacing w:before="240" w:after="160"/>
+        <w:ind w:firstLine="0"/>
+        <w:jc w:val="center"/>
+      </w:pPr>
+      <w:r>
+        <w:rPr>
+          <w:rFonts w:ascii="Times New Roman" w:hAnsi="Times New Roman" w:eastAsia="Times New Roman"/>
+          <w:b/>
+          <w:i w:val="0"/>
+          <w:color w:val="000000"/>
+          <w:sz w:val="24"/>
+        </w:rPr>
+        <w:t>11. ОТВЕТСТВЕННОСТЬ</w:t>
       </w:r>
     </w:p>
     <w:p>
@@ -922,7 +917,24 @@
           <w:color w:val="000000"/>
           <w:sz w:val="24"/>
         </w:rPr>
-        <w:t>10.2. Исполнитель не отвечает за недоступность Сервиса по причинам, зависящим от сети Заказчика, качества исходного файла и действий третьих лиц (хостинг-сбои сверх разумного контроля).</w:t>
+        <w:t>11.1. Совокупная ответственность Лицензиара по Соглашению не превышает сумму, уплаченную Лицензиатом за Пакет в Расчётном периоде, в котором возникло основание требования, за исключением случая, предусмотренного пунктом 11.5 Договора в связи с нарушением конфиденциальности.</w:t>
+      </w:r>
+    </w:p>
+    <w:p>
+      <w:pPr>
+        <w:spacing w:after="120" w:before="0" w:line="240" w:lineRule="auto"/>
+        <w:ind w:firstLine="709"/>
+        <w:jc w:val="both"/>
+      </w:pPr>
+      <w:r>
+        <w:rPr>
+          <w:rFonts w:ascii="Times New Roman" w:hAnsi="Times New Roman" w:eastAsia="Times New Roman"/>
+          <w:b w:val="0"/>
+          <w:i w:val="0"/>
+          <w:color w:val="000000"/>
+          <w:sz w:val="24"/>
+        </w:rPr>
+        <w:t>11.2. Лицензиар не отвечает за недоступность Сервиса по причинам, зависящим от сети Лицензиата, качества исходного файла Excel и действий третьих лиц вне разумного контроля Лицензиара.</w:t>
       </w:r>
     </w:p>
     <w:p>
@@ -939,7 +951,7 @@
           <w:color w:val="000000"/>
           <w:sz w:val="24"/>
         </w:rPr>
-        <w:t>11. ЗАКЛЮЧИТЕЛЬНЫЕ ПОЛОЖЕНИЯ</w:t>
+        <w:t>12. ЗАКЛЮЧИТЕЛЬНЫЕ ПОЛОЖЕНИЯ</w:t>
       </w:r>
     </w:p>
     <w:p>
@@ -956,7 +968,7 @@
           <w:color w:val="000000"/>
           <w:sz w:val="24"/>
         </w:rPr>
-        <w:t>11.1. Приложения: Приложение 1 «Тарифы (пакеты SKU)»; Приложение 2 «Описание Сервиса».</w:t>
+        <w:t>12.1. Неотъемлемой частью Соглашения являются Приложение 1 «Тарифы (пакеты SKU)» и Приложение 2 «Описание Сервиса».</w:t>
       </w:r>
     </w:p>
     <w:p>
@@ -973,7 +985,7 @@
           <w:color w:val="000000"/>
           <w:sz w:val="24"/>
         </w:rPr>
-        <w:t>11.2. Соглашение составлено в двух экземплярах, по одному для каждой Стороны. Допускается подписание в порядке обмена юридически значимыми сообщениями, установленном Договором.</w:t>
+        <w:t>12.2. Соглашение составлено в двух экземплярах, имеющих одинаковую юридическую силу, по одному для каждой из Сторон. Изменения Соглашения действительны, если оформлены в соответствии с пунктом 12.7 Договора.</w:t>
       </w:r>
     </w:p>
     <w:p>
@@ -990,7 +1002,7 @@
           <w:color w:val="000000"/>
           <w:sz w:val="24"/>
         </w:rPr>
-        <w:t>12. РЕКВИЗИТЫ И ПОДПИСИ СТОРОН</w:t>
+        <w:t>ПОДПИСИ СТОРОН</w:t>
       </w:r>
     </w:p>
     <w:tbl>
@@ -1021,7 +1033,7 @@
                 <w:color w:val="000000"/>
                 <w:sz w:val="22"/>
               </w:rPr>
-              <w:t>ИСПОЛНИТЕЛЬ</w:t>
+              <w:t>ЛИЦЕНЗИАР</w:t>
             </w:r>
           </w:p>
         </w:tc>
@@ -1042,7 +1054,7 @@
                 <w:color w:val="000000"/>
                 <w:sz w:val="22"/>
               </w:rPr>
-              <w:t>ЗАКАЗЧИК</w:t>
+              <w:t>ЛИЦЕНЗИАТ</w:t>
             </w:r>
           </w:p>
         </w:tc>
@@ -1080,7 +1092,7 @@
               <w:br/>
               <w:t>БИК: ____________________</w:t>
               <w:br/>
-              <w:t>E-mail для доступа к кабинету: ____________________</w:t>
+              <w:t>E-mail для направления логина Личного кабинета: ____________________</w:t>
               <w:br/>
               <w:br/>
               <w:t>________________ / ________________</w:t>
@@ -1121,7 +1133,7 @@
               <w:br/>
               <w:t>БИК: ____________________</w:t>
               <w:br/>
-              <w:t>E-mail для доступа к кабинету: ____________________</w:t>
+              <w:t>E-mail для направления логина Личного кабинета: ____________________</w:t>
               <w:br/>
               <w:br/>
               <w:t>________________ / ________________</w:t>
@@ -1202,7 +1214,7 @@
           <w:color w:val="000000"/>
           <w:sz w:val="24"/>
         </w:rPr>
-        <w:t>Расчётный период: ____________________. НДС: указать отдельно от лицензии SpacePlanner.</w:t>
+        <w:t>Стоимость указана без НДС. НДС не облагается в соответствии с пп. 26 п. 2 ст. 149 НК РФ (формулировка пункта 8.1 Соглашения).</w:t>
       </w:r>
     </w:p>
     <w:tbl>
@@ -1556,7 +1568,7 @@
           <w:color w:val="000000"/>
           <w:sz w:val="24"/>
         </w:rPr>
-        <w:t>Исполнитель ________________ / __________     Заказчик ________________ / __________</w:t>
+        <w:t>Лицензиар ________________ / __________     Лицензиат ________________ / __________</w:t>
       </w:r>
     </w:p>
     <w:p>
@@ -1629,7 +1641,7 @@
           <w:color w:val="000000"/>
           <w:sz w:val="24"/>
         </w:rPr>
-        <w:t>Сервис доступен на Сайте Сервиса в Личном кабинете Заказчика. Заказчик загружает Excel с номенклатурным справочником и получает обогащённые карточки товаров (ВГХ и фото).</w:t>
+        <w:t>Сервис доступен на Сайте Сервиса в Личном кабинете Лицензиата. Лицензиат загружает Excel с номенклатурным справочником и получает обогащённые карточки товаров (ВГХ и фото).</w:t>
       </w:r>
     </w:p>
     <w:p>
@@ -1646,7 +1658,7 @@
           <w:color w:val="000000"/>
           <w:sz w:val="24"/>
         </w:rPr>
-        <w:t>Качественные габариты и фото — единицы товара, которая продаётся и лежит на полке, а не транспортной коробки. При нескольких вариантах Сервис показывает валидированные и типовые; записывается утверждённый Заказчиком вариант.</w:t>
+        <w:t>Качественные габариты и фото — единицы товара, которая продаётся и лежит на полке, а не транспортной коробки. При нескольких вариантах Сервис показывает валидированные и типовые; записывается утверждённый Лицензиатом вариант.</w:t>
       </w:r>
     </w:p>
     <w:p>
@@ -1697,7 +1709,7 @@
           <w:color w:val="000000"/>
           <w:sz w:val="24"/>
         </w:rPr>
-        <w:t>Исполнитель ________________ / __________     Заказчик ________________ / __________</w:t>
+        <w:t>Лицензиар ________________ / __________     Лицензиат ________________ / __________</w:t>
       </w:r>
     </w:p>
     <w:sectPr>

</xml_diff>

<commit_message>
Charge VAT on Autocards: product is not in the Russian software registry
Co-authored-by: Alena931 <Alena931@users.noreply.github.com>
</commit_message>
<xml_diff>
--- a/DS_Avtokartochki_Starter.docx
+++ b/DS_Avtokartochki_Starter.docx
@@ -713,7 +713,7 @@
           <w:color w:val="000000"/>
           <w:sz w:val="24"/>
         </w:rPr>
-        <w:t>8.1. Стоимость указана без НДС. НДС не облагается в соответствии с пп. 26 п. 2 ст. 149 НК РФ: программы для электронных вычислительных машин и базы данных, право использования которых передается по Договору, включены в единый реестр российских программ для электронных вычислительных машин и баз данных.</w:t>
+        <w:t>8.1. Стоимость Сервиса по настоящему Соглашению указывается с учётом НДС. НДС исчисляется по ставке, установленной законодательством Российской Федерации на дату выставления счёта (на дату составления Соглашения — 20 процентов, если иная ставка не установлена НК РФ). Положения Договора об освобождении от НДС в соответствии с пп. 26 п. 2 ст. 149 НК РФ применяются исключительно к передаче прав на программы, включённые в единый реестр российских программ для ЭВМ и баз данных (SpacePlanner), и не распространяются на Сервис «Автокарточки Starter», который в указанный реестр не включён.</w:t>
       </w:r>
     </w:p>
     <w:p>
@@ -1214,7 +1214,7 @@
           <w:color w:val="000000"/>
           <w:sz w:val="24"/>
         </w:rPr>
-        <w:t>Стоимость указана без НДС. НДС не облагается в соответствии с пп. 26 п. 2 ст. 149 НК РФ (формулировка пункта 8.1 Соглашения).</w:t>
+        <w:t>Стоимость Пакета указывается с НДС (ставка по НК РФ на дату счёта). Льгота пп. 26 п. 2 ст. 149 НК РФ к Сервису не применяется: «Автокарточки Starter» не включены в единый реестр российских программ для ЭВМ и баз данных.</w:t>
       </w:r>
     </w:p>
     <w:tbl>

</xml_diff>